<commit_message>
Updated the proposal and dataset with better details
</commit_message>
<xml_diff>
--- a/Project Proposal Predictive Analysis of EGX30 Stocks.docx
+++ b/Project Proposal Predictive Analysis of EGX30 Stocks.docx
@@ -33,12 +33,12 @@
             <wp:extent cx="2552708" cy="2552708"/>
             <wp:effectExtent b="0" l="0" r="0" t="0"/>
             <wp:wrapNone/>
-            <wp:docPr id="1" name="image1.png"/>
+            <wp:docPr id="1" name="image2.png"/>
             <a:graphic>
               <a:graphicData uri="http://schemas.openxmlformats.org/drawingml/2006/picture">
                 <pic:pic>
                   <pic:nvPicPr>
-                    <pic:cNvPr id="0" name="image1.png"/>
+                    <pic:cNvPr id="0" name="image2.png"/>
                     <pic:cNvPicPr preferRelativeResize="0"/>
                   </pic:nvPicPr>
                   <pic:blipFill>
@@ -67,7 +67,7 @@
           <wp:anchor allowOverlap="1" behindDoc="0" distB="114300" distT="114300" distL="114300" distR="114300" hidden="0" layoutInCell="1" locked="0" relativeHeight="0" simplePos="0">
             <wp:simplePos x="0" y="0"/>
             <wp:positionH relativeFrom="column">
-              <wp:posOffset>4038600</wp:posOffset>
+              <wp:posOffset>3933825</wp:posOffset>
             </wp:positionH>
             <wp:positionV relativeFrom="paragraph">
               <wp:posOffset>114300</wp:posOffset>
@@ -383,12 +383,12 @@
                 <wp:inline distB="19050" distT="19050" distL="19050" distR="19050">
                   <wp:extent cx="190500" cy="152400"/>
                   <wp:effectExtent b="0" l="0" r="0" t="0"/>
-                  <wp:docPr descr="People" id="2" name="image2.png"/>
+                  <wp:docPr descr="People" id="2" name="image1.png"/>
                   <a:graphic>
                     <a:graphicData uri="http://schemas.openxmlformats.org/drawingml/2006/picture">
                       <pic:pic>
                         <pic:nvPicPr>
-                          <pic:cNvPr descr="People" id="0" name="image2.png"/>
+                          <pic:cNvPr descr="People" id="0" name="image1.png"/>
                           <pic:cNvPicPr preferRelativeResize="0"/>
                         </pic:nvPicPr>
                         <pic:blipFill>
@@ -1715,7 +1715,7 @@
           <w:szCs w:val="22"/>
           <w:rtl w:val="0"/>
         </w:rPr>
-        <w:t xml:space="preserve"> method, we will filter out extreme "flash crashes" or data entry errors that fall outside $1.5 x IQR of the daily returns.</w:t>
+        <w:t xml:space="preserve"> method, we will filter out extreme flash crashes or data entry errors that fall outside 1.5 x IQR of the daily returns.</w:t>
       </w:r>
       <w:r>
         <w:rPr>
@@ -2063,7 +2063,32 @@
           <w:vertAlign w:val="baseline"/>
           <w:rtl w:val="0"/>
         </w:rPr>
-        <w:t xml:space="preserve"> Major macroeconomic shifts in Egypt (e.g., currency devaluations) lead to identifiable clusters of high volatility and increased trading volume in the banking and real estate sectors.</w:t>
+        <w:t xml:space="preserve"> Major macroeconomic shifts in Egypt (e.g</w:t>
+      </w:r>
+      <w:r>
+        <w:rPr>
+          <w:rtl w:val="0"/>
+        </w:rPr>
+        <w:t xml:space="preserve">,</w:t>
+      </w:r>
+      <w:r>
+        <w:rPr>
+          <w:rFonts w:ascii="Times New Roman" w:cs="Times New Roman" w:eastAsia="Times New Roman" w:hAnsi="Times New Roman"/>
+          <w:b w:val="0"/>
+          <w:bCs w:val="0"/>
+          <w:i w:val="0"/>
+          <w:iCs w:val="0"/>
+          <w:smallCaps w:val="0"/>
+          <w:strike w:val="0"/>
+          <w:color w:val="000000"/>
+          <w:sz w:val="24"/>
+          <w:szCs w:val="24"/>
+          <w:u w:val="none"/>
+          <w:shd w:fill="auto" w:val="clear"/>
+          <w:vertAlign w:val="baseline"/>
+          <w:rtl w:val="0"/>
+        </w:rPr>
+        <w:t xml:space="preserve"> currency devaluations) lead to identifiable clusters of high volatility and increased trading volume in the banking and real estate sectors.</w:t>
       </w:r>
     </w:p>
     <w:p>

</xml_diff>